<commit_message>
offre Premium Services: retrait branding OPALYA (= autre client), prestataire = Teatower SA, entrepot de Baillonville
Co-Authored-By: Claude Opus 4.8 (1M context) <noreply@anthropic.com>
</commit_message>
<xml_diff>
--- a/Offre_Logistique_PremiumServices_Woyaffe.docx
+++ b/Offre_Logistique_PremiumServices_Woyaffe.docx
@@ -23,7 +23,7 @@
         <w:pStyle w:val="Heading2"/>
       </w:pPr>
       <w:r>
-        <w:t>Entrepôt OPALYA — Baillonville (Zone d'Activités Nord 33, 5377 Baillonville)</w:t>
+        <w:t>Entrepôt Teatower — Baillonville (Zone d'Activités Nord 33, 5377 Baillonville)</w:t>
       </w:r>
     </w:p>
     <w:p>
@@ -35,7 +35,7 @@
         <w:t>Prestataire :</w:t>
       </w:r>
       <w:r>
-        <w:t xml:space="preserve"> TEATOWER SA — Entrepôt OPALYA, Baillonville</w:t>
+        <w:t xml:space="preserve"> TEATOWER SA — Entrepôt de Baillonville</w:t>
       </w:r>
     </w:p>
     <w:p>
@@ -95,7 +95,7 @@
           <w:i/>
           <w:color w:val="555555"/>
         </w:rPr>
-        <w:t>Prestations gérées et tracées via la plateforme **Odoo Teatower**, entrepôt OPALYA, emplacement OPA/Stock — accès en lecture temps réel au stock pour le Client.</w:t>
+        <w:t>Prestations gérées et tracées via la plateforme **Odoo Teatower** — accès en lecture temps réel au stock pour le Client.</w:t>
       </w:r>
     </w:p>
     <w:p>
@@ -991,7 +991,7 @@
         <w:t>Facturation :</w:t>
       </w:r>
       <w:r>
-        <w:t xml:space="preserve"> mensuelle, le dernier jour ouvrable du mois, via Odoo Teatower. Référence `OPALYA-PREMIUM-AAAAMM`.</w:t>
+        <w:t xml:space="preserve"> mensuelle, le dernier jour ouvrable du mois, via Odoo Teatower. Référence `TT-PREMIUM-AAAAMM`.</w:t>
       </w:r>
     </w:p>
     <w:p>
@@ -1416,7 +1416,7 @@
     </w:p>
     <w:p>
       <w:r>
-        <w:t>*Offre établie sur la base du modèle logistique OPALYA. Tarifs révisables annuellement au 1er janvier. Pour toute question : [contact Teatower].*</w:t>
+        <w:t>*Offre établie sur la base du modèle logistique Teatower. Tarifs révisables annuellement au 1er janvier. Pour toute question : [contact Teatower].*</w:t>
       </w:r>
     </w:p>
     <w:sectPr>

</xml_diff>

<commit_message>
offre logistique: picking forfait unique par colis (sans tarif a la ligne), courrier domiciliation inclus sans plafond, ref facture TT-LOG-AAAAMM (sans opalya/premium)
Co-Authored-By: Claude Opus 4.8 (1M context) <noreply@anthropic.com>
</commit_message>
<xml_diff>
--- a/Offre_Logistique_PremiumServices_Woyaffe.docx
+++ b/Offre_Logistique_PremiumServices_Woyaffe.docx
@@ -500,7 +500,7 @@
           </w:tcPr>
           <w:p>
             <w:r>
-              <w:t>Préparation commande — forfait colis (jusqu'à 3 lignes, emballage standard inclus)</w:t>
+              <w:t>Préparation commande (picking + emballage standard inclus, quel que soit le nombre de lignes)</w:t>
             </w:r>
           </w:p>
         </w:tc>
@@ -521,38 +521,6 @@
           <w:p>
             <w:r>
               <w:t>2,50 €</w:t>
-            </w:r>
-          </w:p>
-        </w:tc>
-      </w:tr>
-      <w:tr>
-        <w:tc>
-          <w:tcPr>
-            <w:tcW w:type="dxa" w:w="2880"/>
-          </w:tcPr>
-          <w:p>
-            <w:r>
-              <w:t>Ligne de picking supplémentaire (au-delà de 3)</w:t>
-            </w:r>
-          </w:p>
-        </w:tc>
-        <w:tc>
-          <w:tcPr>
-            <w:tcW w:type="dxa" w:w="2880"/>
-          </w:tcPr>
-          <w:p>
-            <w:r>
-              <w:t>par ligne</w:t>
-            </w:r>
-          </w:p>
-        </w:tc>
-        <w:tc>
-          <w:tcPr>
-            <w:tcW w:type="dxa" w:w="2880"/>
-          </w:tcPr>
-          <w:p>
-            <w:r>
-              <w:t>0,50 €</w:t>
             </w:r>
           </w:p>
         </w:tc>
@@ -920,7 +888,7 @@
           </w:tcPr>
           <w:p>
             <w:r>
-              <w:t>jusqu'à 20 plis / mois</w:t>
+              <w:t>inclus</w:t>
             </w:r>
           </w:p>
         </w:tc>
@@ -991,7 +959,7 @@
         <w:t>Facturation :</w:t>
       </w:r>
       <w:r>
-        <w:t xml:space="preserve"> mensuelle, le dernier jour ouvrable du mois, via Odoo Teatower. Référence `TT-PREMIUM-AAAAMM`.</w:t>
+        <w:t xml:space="preserve"> mensuelle, le dernier jour ouvrable du mois, via Odoo Teatower. Référence `TT-LOG-AAAAMM`.</w:t>
       </w:r>
     </w:p>
     <w:p>

</xml_diff>